<commit_message>
docs: clarify manufacturer liability waiver
</commit_message>
<xml_diff>
--- a/AaTempSpoof_内核伪装温度墙风险免责声明.docx
+++ b/AaTempSpoof_内核伪装温度墙风险免责声明.docx
@@ -457,7 +457,7 @@
           <w:sz w:val="19"/>
           <w:szCs w:val="19"/>
         </w:rPr>
-        <w:t>3. AaTempSpoof 为非官方 Root 模块。开发者无法监控设备和环境；在法律允许范围内，因使用、误用、组合使用或未及时停止造成的事故、维修费用与损失由使用者承担。本声明不排除法律规定不得排除的责任。</w:t>
+        <w:t>3. AaTempSpoof 是未经手机及设备制造商、品牌方和相关厂商授权的非官方 Root 模块。本人自愿 Root、伪装温度并解除原厂保护；由此产生的设备损坏、保修失效、电池事故、数据丢失、人身伤害、财产损失、维修费用及其他全部风险与责任均由本人承担，开发者以及设备制造商、品牌方、系统/内核、芯片、电池、充电器、线材、销售和售后主体均不承担责任，但法律强制规定不得排除的责任除外。</w:t>
       </w:r>
     </w:p>
     <w:p>
@@ -484,7 +484,7 @@
           <w:sz w:val="19"/>
           <w:szCs w:val="19"/>
         </w:rPr>
-        <w:t xml:space="preserve">□ 我确认显示正常温度不等于真实温度正常；  □ 我确认软件断充和残余硬件保护仍可能失效；  □ 我自愿承担阈值设置、使用环境及充电行为产生的相应风险与后果。</w:t>
+        <w:t xml:space="preserve">□ 我确认显示温度不等于真实温度；  □ 我确认软件断充及残余硬件保护可能失效；  □ 我确认相关厂商未授权本功能，因主动改装产生的全部风险、损失和责任由本人承担。</w:t>
       </w:r>
     </w:p>
     <w:p>

</xml_diff>

<commit_message>
Update AaTempSpoof generated cloud files 1785414673
</commit_message>
<xml_diff>
--- a/AaTempSpoof_内核伪装温度墙风险免责声明.docx
+++ b/AaTempSpoof_内核伪装温度墙风险免责声明.docx
@@ -457,7 +457,7 @@
           <w:sz w:val="19"/>
           <w:szCs w:val="19"/>
         </w:rPr>
-        <w:t>3. AaTempSpoof 是未经手机及设备制造商、品牌方和相关厂商授权的非官方 Root 模块。本人自愿 Root、伪装温度并解除原厂保护；由此产生的设备损坏、保修失效、电池事故、数据丢失、人身伤害、财产损失、维修费用及其他全部风险与责任均由本人承担，开发者以及设备制造商、品牌方、系统/内核、芯片、电池、充电器、线材、销售和售后主体均不承担责任，但法律强制规定不得排除的责任除外。</w:t>
+        <w:t>3. AaTempSpoof 为非官方 Root 模块。开发者无法监控设备和环境；在法律允许范围内，因使用、误用、组合使用或未及时停止造成的事故、维修费用与损失由使用者承担。本声明不排除法律规定不得排除的责任。</w:t>
       </w:r>
     </w:p>
     <w:p>
@@ -484,7 +484,7 @@
           <w:sz w:val="19"/>
           <w:szCs w:val="19"/>
         </w:rPr>
-        <w:t xml:space="preserve">□ 我确认显示温度不等于真实温度；  □ 我确认软件断充及残余硬件保护可能失效；  □ 我确认相关厂商未授权本功能，因主动改装产生的全部风险、损失和责任由本人承担。</w:t>
+        <w:t xml:space="preserve">□ 我确认显示正常温度不等于真实温度正常；  □ 我确认软件断充和残余硬件保护仍可能失效；  □ 我自愿承担阈值设置、使用环境及充电行为产生的相应风险与后果。</w:t>
       </w:r>
     </w:p>
     <w:p>

</xml_diff>

<commit_message>
docs: persist manufacturer liability waiver
</commit_message>
<xml_diff>
--- a/AaTempSpoof_内核伪装温度墙风险免责声明.docx
+++ b/AaTempSpoof_内核伪装温度墙风险免责声明.docx
@@ -457,7 +457,7 @@
           <w:sz w:val="19"/>
           <w:szCs w:val="19"/>
         </w:rPr>
-        <w:t>3. AaTempSpoof 为非官方 Root 模块。开发者无法监控设备和环境；在法律允许范围内，因使用、误用、组合使用或未及时停止造成的事故、维修费用与损失由使用者承担。本声明不排除法律规定不得排除的责任。</w:t>
+        <w:t>3. AaTempSpoof 是未经手机及设备制造商、品牌方和相关厂商授权的非官方 Root 模块。本人自愿 Root、伪装温度并解除原厂保护；由此产生的设备损坏、保修失效、电池事故、数据丢失、人身伤害、财产损失、维修费用及其他全部风险与责任均由本人承担，开发者以及设备制造商、品牌方、系统/内核、芯片、电池、充电器、线材、销售和售后主体均不承担责任，但法律强制规定不得排除的责任除外。</w:t>
       </w:r>
     </w:p>
     <w:p>
@@ -484,7 +484,7 @@
           <w:sz w:val="19"/>
           <w:szCs w:val="19"/>
         </w:rPr>
-        <w:t xml:space="preserve">□ 我确认显示正常温度不等于真实温度正常；  □ 我确认软件断充和残余硬件保护仍可能失效；  □ 我自愿承担阈值设置、使用环境及充电行为产生的相应风险与后果。</w:t>
+        <w:t xml:space="preserve">□ 我确认显示温度不等于真实温度；  □ 我确认软件断充及残余硬件保护可能失效；  □ 我确认相关厂商未授权本功能，因主动改装产生的全部风险、损失和责任由本人承担。</w:t>
       </w:r>
     </w:p>
     <w:p>

</xml_diff>